<commit_message>
Make proposal preparer name and email JSON-driven
Tokenize the preparer on the cover so each salesperson can generate proposals
under their own name and email instead of a hard-coded value.

- template.docx: {{PREPARED_BY_NAME}} and {{PREPARED_BY_EMAIL}} on the cover;
  the email token is also placed in the hyperlink relationship so the mailto
  link updates too
- generate_proposal.py: reads meta.preparedByName / meta.preparedByEmail
  (defaulting to Guy Fuller / gfuller@allstarpartners.com) and fills both
  word/document.xml and word/_rels/document.xml.rels
- README.md: documents the new optional fields

Verified: default preparer reproduces the Any FQHC proposal; a custom
preparer updates the cover name, the displayed email, and the mailto target
with no residual tokens; outputs pass docx schema validation.

Co-Authored-By: Claude Opus 4.8 <noreply@anthropic.com>
Claude-Session: https://claude.ai/code/session_016EtA9fGsnK7orVGdk98L7r
</commit_message>
<xml_diff>
--- a/proposal-tool/template.docx
+++ b/proposal-tool/template.docx
@@ -28,7 +28,7 @@
       <w:r>
         <w:t xml:space="preserve">Prepared By: </w:t>
         <w:tab/>
-        <w:t xml:space="preserve">Guy Fuller (</w:t>
+        <w:t xml:space="preserve">{{PREPARED_BY_NAME}} (</w:t>
       </w:r>
       <w:hyperlink r:id="rId12" w:history="1">
         <w:r>
@@ -36,7 +36,7 @@
             <w:rStyle w:val="Hyperlink"/>
             <w:color w:val="FFFFFF" w:themeColor="background1"/>
           </w:rPr>
-          <w:t>gfuller@allstarpartners.com</w:t>
+          <w:t>{{PREPARED_BY_EMAIL}}</w:t>
         </w:r>
       </w:hyperlink>
       <w:r>

</xml_diff>

<commit_message>
Add editable Executive Overview to the proposal tool
Make the page-1 Executive Overview editable instead of baked into the template.

- template.docx: three Executive Overview paragraphs collapse to a single
  {{EXEC_OVERVIEW}} region (Calibri body formatting preserved)
- index.html: Executive Overview editor pre-filled with the default wording;
  syncs to the client name until edited, with "Reset to default"; carried in
  the JSON as meta.executiveOverview (export + upload)
- generate_proposal.py: optional meta.executiveOverview (blank lines separate
  paragraphs); default wording with the client name when omitted
- README: document the new field

Verified end to end: default and custom multi-paragraph overviews produce
schema-valid .docx; web JSON export round-trips through the CLI.

Co-Authored-By: Claude Opus 4.8 <noreply@anthropic.com>
Claude-Session: https://claude.ai/code/session_016EtA9fGsnK7orVGdk98L7r
</commit_message>
<xml_diff>
--- a/proposal-tool/template.docx
+++ b/proposal-tool/template.docx
@@ -601,33 +601,7 @@
         <w:rPr>
           <w:rFonts w:ascii="Calibri" w:hAnsi="Calibri" w:cs="Calibri"/>
         </w:rPr>
-        <w:t>{{CLIENT_NAME}} operates in a demanding environment where reliability, security, and cost control are essential to its core mission. As {{CLIENT_NAME}} continues to grow and serve its community, predictable and dependable technology support is no longer optional—it is foundational to operational stability, security, and organizational confidence.</w:t>
-      </w:r>
-    </w:p>
-    <w:p>
-      <w:pPr>
-        <w:rPr>
-          <w:rFonts w:ascii="Calibri" w:hAnsi="Calibri" w:cs="Calibri"/>
-        </w:rPr>
-      </w:pPr>
-      <w:r>
-        <w:rPr>
-          <w:rFonts w:ascii="Calibri" w:hAnsi="Calibri" w:cs="Calibri"/>
-        </w:rPr>
-        <w:t>ALLSTAR Partners proposes a structured, predictive monthly billing model designed to eliminate the frustration and uncertainty of variable IT expenses. This approach replaces reactive, project-based invoicing with a consistent monthly investment that covers a broad range of technical support and security services. {{CLIENT_NAME}} gains clear financial visibility while ensuring continuous access to experienced professionals who understand its operational demands.</w:t>
-      </w:r>
-    </w:p>
-    <w:p>
-      <w:pPr>
-        <w:rPr>
-          <w:rFonts w:ascii="Calibri" w:hAnsi="Calibri" w:cs="Calibri"/>
-        </w:rPr>
-      </w:pPr>
-      <w:r>
-        <w:rPr>
-          <w:rFonts w:ascii="Calibri" w:hAnsi="Calibri" w:cs="Calibri"/>
-        </w:rPr>
-        <w:t>ALLSTAR Partners brings a proven track record of delivering reliable, high-value managed services to organizations that demand accountability, security, and consistency. Our philosophy is simple: build stability, bake in security, and provide leadership—not just support. This proposal reflects a long-term partnership focused on operational confidence, financial predictability, and measurable results.</w:t>
+        <w:t xml:space="preserve">{{EXEC_OVERVIEW}}</w:t>
       </w:r>
     </w:p>
     <w:p>

</xml_diff>

<commit_message>
Make Proposal Summary and Additional Terms editable
Extend the editable-prose mechanism (used for the Executive Overview) to two
more deal-specific sections.

- template.docx: Proposal Summary intro -> {{PROPOSAL_SUMMARY}} (Calibri body);
  the five Additional Terms items -> {{TERMS}} (Heading2 numbered items)
- index.html: a section registry drives three editors (Executive Overview,
  Proposal Summary, Additional Terms) — defaults pre-filled, client-synced
  until edited, Reset links, JSON export/import
- generate_proposal.py: optional meta.proposalSummary and meta.additionalTerms
  via a shared paragraph builder; defaults when omitted
- README: document the new fields; note the fixed sections stay fixed

Verified: defaults + custom (multi-paragraph, variable term count, special
chars) produce schema-valid .docx; web export round-trips through the CLI.

Co-Authored-By: Claude Opus 4.8 <noreply@anthropic.com>
Claude-Session: https://claude.ai/code/session_016EtA9fGsnK7orVGdk98L7r
</commit_message>
<xml_diff>
--- a/proposal-tool/template.docx
+++ b/proposal-tool/template.docx
@@ -626,7 +626,7 @@
         <w:rPr>
           <w:rFonts w:ascii="Calibri" w:hAnsi="Calibri" w:cs="Calibri"/>
         </w:rPr>
-        <w:t xml:space="preserve">{{CLIENT_NAME}} (referred to as “Client”) relies on secure, dependable technology to operate effectively. ALLSTAR Partners (referred to as “ASP”) is a Cybersecurity-focused Managed Service Provider (MSP+) with extensive experience in supporting organizations like {{CLIENT_NAME}} with their technology requirements.</w:t>
+        <w:t xml:space="preserve">{{PROPOSAL_SUMMARY}}</w:t>
       </w:r>
     </w:p>
     <w:p>
@@ -3711,40 +3711,7 @@
         <w:pStyle w:val="Heading2"/>
       </w:pPr>
       <w:r>
-        <w:t xml:space="preserve">Upon request ASP Engineers will be assigned unique accounts with sufficient access to Client infrastructure and systems to accomplish the Work or Services in this Proposal. For highly sensitive tasks, ASP Engineers may work alongside the Client to complete restricted work.</w:t>
-      </w:r>
-    </w:p>
-    <w:p>
-      <w:pPr>
-        <w:pStyle w:val="Heading2"/>
-      </w:pPr>
-      <w:r>
-        <w:t>Work and Services will be performed remotely as much as possible.</w:t>
-      </w:r>
-    </w:p>
-    <w:p>
-      <w:pPr>
-        <w:pStyle w:val="Heading2"/>
-      </w:pPr>
-      <w:r>
-        <w:t>For ASP engineers working on site the Client is expected to provide a workspace area large enough to accommodate a laptop with a desk, a chair, electric power and Internet access.</w:t>
-      </w:r>
-    </w:p>
-    <w:p>
-      <w:pPr>
-        <w:pStyle w:val="Heading2"/>
-      </w:pPr>
-      <w:r>
-        <w:t xml:space="preserve">Additional costs may apply if the Client network equipment does not support port mirroring or an equivalent configuration and active network traffic monitoring via SIEM is required. Alternatively, the Client may decline to implement active network traffic monitoring if the equipment cannot be configured to support it.</w:t>
-      </w:r>
-    </w:p>
-    <w:p>
-      <w:pPr>
-        <w:pStyle w:val="Heading2"/>
-      </w:pPr>
-      <w:r>
-        <w:t xml:space="preserve">All emergency recovery services are best effort only without guarantee.</w:t>
-        <w:br w:type="page"/>
+        <w:t xml:space="preserve">{{TERMS}}</w:t>
       </w:r>
     </w:p>
     <w:p>

</xml_diff>

<commit_message>
Add selectable product line (Healthcare / Enterprise / Business IT)
The brand shown in every proposal heading (cover, summary, Scope of Services,
and price table) is now chosen from a dropdown instead of the fixed
'ASP Secure IT'.

- template.docx: all 19 brand occurrences -> {{BRAND}}
- index.html: 'Product line' dropdown (ASP Healthcare/Enterprise/Business IT,
  default Healthcare); service-item labels update live; exported/imported via
  meta.productLine
- generate_proposal.py: optional meta.productLine (default ASP Healthcare IT)
- README/sample: document the field

All other descriptions remain fixed. Verified: each option replaces all 19
headings incl. the cover title; valid docx; web JSON round-trips via the CLI.

Co-Authored-By: Claude Opus 4.8 <noreply@anthropic.com>
Claude-Session: https://claude.ai/code/session_016EtA9fGsnK7orVGdk98L7r
</commit_message>
<xml_diff>
--- a/proposal-tool/template.docx
+++ b/proposal-tool/template.docx
@@ -8,7 +8,7 @@
         <w:spacing w:before="11100"/>
       </w:pPr>
       <w:r>
-        <w:t xml:space="preserve">ASP Enterprise IT ® Managed Services</w:t>
+        <w:t xml:space="preserve">{{BRAND}} ® Managed Services</w:t>
       </w:r>
     </w:p>
     <w:p>
@@ -662,7 +662,7 @@
           <w:b/>
           <w:bCs/>
         </w:rPr>
-        <w:t xml:space="preserve">ASP Secure IT ® Managed Site - </w:t>
+        <w:t xml:space="preserve">{{BRAND}} ® Managed Site - </w:t>
       </w:r>
       <w:r>
         <w:t xml:space="preserve">Managed Site is the foundational hub for all our services. From this core, Managed Services deliver vulnerability monitoring, proactive network log collection, strategic IT reporting and IT recommendations for your business.</w:t>
@@ -685,7 +685,7 @@
           <w:b/>
           <w:bCs/>
         </w:rPr>
-        <w:t xml:space="preserve">ASP Secure IT ® Managed User - </w:t>
+        <w:t xml:space="preserve">{{BRAND}} ® Managed User - </w:t>
       </w:r>
       <w:r>
         <w:t xml:space="preserve">Ongoing cybersecurity training, including phishing attack simulations, dark web monitoring, enforcement of security policies and interactive leaderboards to track progress and foster a security-conscious culture.</w:t>
@@ -708,7 +708,7 @@
           <w:b/>
           <w:bCs/>
         </w:rPr>
-        <w:t xml:space="preserve">ASP Secure IT ® Managed Identity - </w:t>
+        <w:t xml:space="preserve">{{BRAND}} ® Managed Identity - </w:t>
       </w:r>
       <w:r>
         <w:t xml:space="preserve">Provides 24/7 SOC monitoring and ITDR for session hijacking, credential theft, suspicious inbox rules, and rogue apps, with investigations, triage, and threat hunting. Automated remediation isolates identities. Daily backups of email, files, and data with offsite storage enable fast recovery from deletion, ransomware, and loss beyond native retention. ISPM hardens identity posture by fixing misconfigurations, risky access, and policy drift.</w:t>
@@ -731,7 +731,7 @@
           <w:b/>
           <w:bCs/>
         </w:rPr>
-        <w:t xml:space="preserve">ASP Secure IT ® Managed Device - </w:t>
+        <w:t xml:space="preserve">{{BRAND}} ® Managed Device - </w:t>
       </w:r>
       <w:r>
         <w:t xml:space="preserve">Provides 24/7 SOC monitoring of traffic on all segments via SIEM appliances, with alert triage and appliance management. Activity monitoring covers device logs from configured sources with triage and source management. Device Support includes lifecycle management, remediation, and Direct-to-Cloud config backups.</w:t>
@@ -755,7 +755,7 @@
           <w:bCs/>
         </w:rPr>
         <w:lastRenderedPageBreak/>
-        <w:t xml:space="preserve">ASP Secure IT ® Managed Workstation -</w:t>
+        <w:t xml:space="preserve">{{BRAND}} ® Managed Workstation -</w:t>
       </w:r>
       <w:r>
         <w:t xml:space="preserve"> Provides dual SOC monitoring with SentinelOne and Huntress for 24/7 oversight of computers with MDR agents, with alert triage and EDR agent management. Remediation delivers 24/7 threat containment and best-effort response with custom reports. DNS Filtering manages content filtering, agent activation, and blocked threat reporting.</w:t>
@@ -778,7 +778,7 @@
           <w:b/>
           <w:bCs/>
         </w:rPr>
-        <w:t xml:space="preserve">ASP Secure IT ® Managed Server - </w:t>
+        <w:t xml:space="preserve">{{BRAND}} ® Managed Server - </w:t>
       </w:r>
       <w:r>
         <w:t xml:space="preserve">Provide 24/7 NOC monitoring of servers with RMM agents and dual SOC monitoring via SentinelOne &amp; Huntress for computers with MDR agents, with alert triage and agent management. Remediation delivers 24/7 threat containment with custom reports. DNS Filtering manages content filtering, agent activation, and blocked threat reporting.</w:t>
@@ -1115,7 +1115,7 @@
           <w:bCs/>
           <w:color w:val="CF118C"/>
         </w:rPr>
-        <w:t xml:space="preserve">ASP Secure IT – Managed Site</w:t>
+        <w:t xml:space="preserve">{{BRAND}} – Managed Site</w:t>
       </w:r>
     </w:p>
     <w:p>
@@ -1389,7 +1389,7 @@
           <w:b/>
           <w:color w:val="CF118C"/>
         </w:rPr>
-        <w:t xml:space="preserve">ASP Secure IT – Managed User</w:t>
+        <w:t xml:space="preserve">{{BRAND}} – Managed User</w:t>
       </w:r>
     </w:p>
     <w:p>
@@ -1505,7 +1505,7 @@
           <w:b/>
           <w:color w:val="CF118C"/>
         </w:rPr>
-        <w:t xml:space="preserve">ASP Secure IT – Managed Identity</w:t>
+        <w:t xml:space="preserve">{{BRAND}} – Managed Identity</w:t>
       </w:r>
     </w:p>
     <w:p>
@@ -1669,7 +1669,7 @@
           <w:b/>
           <w:color w:val="CF118C"/>
         </w:rPr>
-        <w:t xml:space="preserve">ASP Secure IT - Managed Device</w:t>
+        <w:t xml:space="preserve">{{BRAND}} - Managed Device</w:t>
       </w:r>
     </w:p>
     <w:p>
@@ -1873,7 +1873,7 @@
           <w:b/>
           <w:color w:val="CF118C"/>
         </w:rPr>
-        <w:t xml:space="preserve">ASP Secure IT - Managed Workstation</w:t>
+        <w:t xml:space="preserve">{{BRAND}} - Managed Workstation</w:t>
       </w:r>
     </w:p>
     <w:p>
@@ -2095,7 +2095,7 @@
           <w:bCs/>
           <w:color w:val="CF118C"/>
         </w:rPr>
-        <w:t xml:space="preserve">ASP Secure IT – Managed Server</w:t>
+        <w:t xml:space="preserve">{{BRAND}} – Managed Server</w:t>
       </w:r>
     </w:p>
     <w:p>
@@ -2788,7 +2788,7 @@
                 <w:sz w:val="20"/>
                 <w:szCs w:val="20"/>
               </w:rPr>
-              <w:t xml:space="preserve">ASP Secure IT ® Managed Site (${{UNIT_SITE}}/Site)</w:t>
+              <w:t xml:space="preserve">{{BRAND}} ® Managed Site (${{UNIT_SITE}}/Site)</w:t>
             </w:r>
           </w:p>
         </w:tc>
@@ -2854,7 +2854,7 @@
                 <w:sz w:val="20"/>
                 <w:szCs w:val="20"/>
               </w:rPr>
-              <w:t xml:space="preserve">ASP Secure IT ® Managed User (${{UNIT_USER}}/User)</w:t>
+              <w:t xml:space="preserve">{{BRAND}} ® Managed User (${{UNIT_USER}}/User)</w:t>
             </w:r>
           </w:p>
         </w:tc>
@@ -2920,7 +2920,7 @@
                 <w:sz w:val="20"/>
                 <w:szCs w:val="20"/>
               </w:rPr>
-              <w:t xml:space="preserve">ASP Secure IT ® Managed Identity (${{UNIT_IDENTITY}}/Identity)</w:t>
+              <w:t xml:space="preserve">{{BRAND}} ® Managed Identity (${{UNIT_IDENTITY}}/Identity)</w:t>
             </w:r>
           </w:p>
         </w:tc>
@@ -2986,7 +2986,7 @@
                 <w:sz w:val="20"/>
                 <w:szCs w:val="20"/>
               </w:rPr>
-              <w:t xml:space="preserve">ASP Secure IT ® Managed Device (${{UNIT_DEVICE}}/Device)</w:t>
+              <w:t xml:space="preserve">{{BRAND}} ® Managed Device (${{UNIT_DEVICE}}/Device)</w:t>
             </w:r>
           </w:p>
         </w:tc>
@@ -3052,7 +3052,7 @@
                 <w:sz w:val="20"/>
                 <w:szCs w:val="20"/>
               </w:rPr>
-              <w:t xml:space="preserve">ASP Secure IT ® Managed Workstation (${{UNIT_WORKSTATION}}/Workstation)</w:t>
+              <w:t xml:space="preserve">{{BRAND}} ® Managed Workstation (${{UNIT_WORKSTATION}}/Workstation)</w:t>
             </w:r>
           </w:p>
         </w:tc>
@@ -3118,7 +3118,7 @@
                 <w:sz w:val="20"/>
                 <w:szCs w:val="20"/>
               </w:rPr>
-              <w:t xml:space="preserve">ASP Secure IT ® Managed Server (${{UNIT_SERVER}}/Server)</w:t>
+              <w:t xml:space="preserve">{{BRAND}} ® Managed Server (${{UNIT_SERVER}}/Server)</w:t>
             </w:r>
           </w:p>
         </w:tc>

</xml_diff>